<commit_message>
Adding Presentation and Final Documents
</commit_message>
<xml_diff>
--- a/Capstone3_iPSC/Reports/Capstone3_iPSC_Final Report.docx
+++ b/Capstone3_iPSC/Reports/Capstone3_iPSC_Final Report.docx
@@ -385,7 +385,21 @@
           <w:rPr>
             <w:rStyle w:val="Hyperlink"/>
           </w:rPr>
-          <w:t>https://github.com/single-cell- genetics/singlecell_endodiff_paper/tree/main</w:t>
+          <w:t>https://github.com/single-cell- genetics/</w:t>
+        </w:r>
+        <w:proofErr w:type="spellStart"/>
+        <w:r>
+          <w:rPr>
+            <w:rStyle w:val="Hyperlink"/>
+          </w:rPr>
+          <w:t>singlecell_endodiff_paper</w:t>
+        </w:r>
+        <w:proofErr w:type="spellEnd"/>
+        <w:r>
+          <w:rPr>
+            <w:rStyle w:val="Hyperlink"/>
+          </w:rPr>
+          <w:t>/tree/main</w:t>
         </w:r>
       </w:hyperlink>
       <w:r>
@@ -474,10 +488,18 @@
         <w:t>transforming</w:t>
       </w:r>
       <w:r>
-        <w:t xml:space="preserve"> the csv file into a ScanPy object called `adat</w:t>
-      </w:r>
-      <w:r>
-        <w:t>a`</w:t>
+        <w:t xml:space="preserve"> the csv file into a ScanPy object called `</w:t>
+      </w:r>
+      <w:proofErr w:type="spellStart"/>
+      <w:r>
+        <w:t>adat</w:t>
+      </w:r>
+      <w:r>
+        <w:t>a</w:t>
+      </w:r>
+      <w:proofErr w:type="spellEnd"/>
+      <w:r>
+        <w:t>`</w:t>
       </w:r>
       <w:r>
         <w:t xml:space="preserve">. </w:t>
@@ -486,10 +508,18 @@
         <w:t>This puts the</w:t>
       </w:r>
       <w:r>
-        <w:t xml:space="preserve"> RNA</w:t>
-      </w:r>
-      <w:r>
-        <w:t xml:space="preserve"> counts data in a</w:t>
+        <w:t xml:space="preserve"> </w:t>
+      </w:r>
+      <w:proofErr w:type="gramStart"/>
+      <w:r>
+        <w:t>RNA</w:t>
+      </w:r>
+      <w:r>
+        <w:t xml:space="preserve"> counts</w:t>
+      </w:r>
+      <w:proofErr w:type="gramEnd"/>
+      <w:r>
+        <w:t xml:space="preserve"> data in a</w:t>
       </w:r>
       <w:r>
         <w:t>n expression</w:t>
@@ -2093,7 +2123,15 @@
         <w:t>The second metric by which we will rank donors is DE Score.</w:t>
       </w:r>
       <w:r>
-        <w:t xml:space="preserve"> To do this, we will use a function in ScanPy called score_genes, which </w:t>
+        <w:t xml:space="preserve"> To do this, we will use a function in ScanPy called </w:t>
+      </w:r>
+      <w:proofErr w:type="spellStart"/>
+      <w:r>
+        <w:t>score_genes</w:t>
+      </w:r>
+      <w:proofErr w:type="spellEnd"/>
+      <w:r>
+        <w:t xml:space="preserve">, which </w:t>
       </w:r>
       <w:r>
         <w:t>take</w:t>
@@ -2243,7 +2281,15 @@
         <w:t>iPSC genes.</w:t>
       </w:r>
       <w:r>
-        <w:t xml:space="preserve"> From here, we ran score_genes on the lists </w:t>
+        <w:t xml:space="preserve"> From here, we ran </w:t>
+      </w:r>
+      <w:proofErr w:type="spellStart"/>
+      <w:r>
+        <w:t>score_genes</w:t>
+      </w:r>
+      <w:proofErr w:type="spellEnd"/>
+      <w:r>
+        <w:t xml:space="preserve"> on the lists </w:t>
       </w:r>
       <w:r>
         <w:t>to create the final DE score for each cell</w:t>
@@ -2261,13 +2307,37 @@
         <w:t xml:space="preserve">DE scores </w:t>
       </w:r>
       <w:r>
-        <w:t>were calculated from the mean DE Score for day3 cells for each donor.</w:t>
-      </w:r>
-      <w:r>
-        <w:t xml:space="preserve"> The donor DE score for day3 was mapped to </w:t>
-      </w:r>
-      <w:r>
-        <w:t>all cells by donor, regardless of day, as a new column called DEscore_long.</w:t>
+        <w:t xml:space="preserve">were calculated from the mean DE Score for </w:t>
+      </w:r>
+      <w:proofErr w:type="gramStart"/>
+      <w:r>
+        <w:t>day3</w:t>
+      </w:r>
+      <w:proofErr w:type="gramEnd"/>
+      <w:r>
+        <w:t xml:space="preserve"> cells for each donor.</w:t>
+      </w:r>
+      <w:r>
+        <w:t xml:space="preserve"> The donor DE score for </w:t>
+      </w:r>
+      <w:proofErr w:type="gramStart"/>
+      <w:r>
+        <w:t>day3</w:t>
+      </w:r>
+      <w:proofErr w:type="gramEnd"/>
+      <w:r>
+        <w:t xml:space="preserve"> was mapped to </w:t>
+      </w:r>
+      <w:r>
+        <w:t xml:space="preserve">all cells by donor, regardless of day, as a new column called </w:t>
+      </w:r>
+      <w:proofErr w:type="spellStart"/>
+      <w:r>
+        <w:t>DEscore_long</w:t>
+      </w:r>
+      <w:proofErr w:type="spellEnd"/>
+      <w:r>
+        <w:t>.</w:t>
       </w:r>
     </w:p>
     <w:p>
@@ -2444,20 +2514,29 @@
           <w:sz w:val="22"/>
           <w:szCs w:val="22"/>
         </w:rPr>
-        <w:t>aka DErank</w:t>
-      </w:r>
+        <w:t xml:space="preserve">aka </w:t>
+      </w:r>
+      <w:proofErr w:type="spellStart"/>
       <w:r>
         <w:rPr>
           <w:sz w:val="22"/>
           <w:szCs w:val="22"/>
         </w:rPr>
-        <w:t xml:space="preserve">) </w:t>
-      </w:r>
+        <w:t>DErank</w:t>
+      </w:r>
+      <w:proofErr w:type="spellEnd"/>
       <w:r>
         <w:rPr>
           <w:sz w:val="22"/>
           <w:szCs w:val="22"/>
         </w:rPr>
+        <w:t xml:space="preserve">) </w:t>
+      </w:r>
+      <w:r>
+        <w:rPr>
+          <w:sz w:val="22"/>
+          <w:szCs w:val="22"/>
+        </w:rPr>
         <w:t>increases from day0 to day3.</w:t>
       </w:r>
     </w:p>
@@ -2704,7 +2783,11 @@
         <w:t>, the raw counts (saved in the ‘counts’ layer of the ScanPy object) were summed</w:t>
       </w:r>
       <w:r>
-        <w:t xml:space="preserve"> for all cells in each donor, which resulted in a new dataset called donor_</w:t>
+        <w:t xml:space="preserve"> for all cells in each donor, which resulted in a new dataset called </w:t>
+      </w:r>
+      <w:proofErr w:type="spellStart"/>
+      <w:r>
+        <w:t>donor_</w:t>
       </w:r>
       <w:r>
         <w:t>a</w:t>
@@ -2712,11 +2795,20 @@
       <w:r>
         <w:t>data</w:t>
       </w:r>
+      <w:proofErr w:type="spellEnd"/>
       <w:r>
         <w:t xml:space="preserve">. </w:t>
       </w:r>
       <w:r>
-        <w:t>This dataset was then normalized and log transformed in preparation for modelling.</w:t>
+        <w:t xml:space="preserve">This dataset was then normalized and log transformed </w:t>
+      </w:r>
+      <w:proofErr w:type="gramStart"/>
+      <w:r>
+        <w:t>in</w:t>
+      </w:r>
+      <w:proofErr w:type="gramEnd"/>
+      <w:r>
+        <w:t xml:space="preserve"> preparation for modelling.</w:t>
       </w:r>
     </w:p>
     <w:p>
@@ -5790,6 +5882,7 @@
                 <w:szCs w:val="22"/>
               </w:rPr>
             </w:pPr>
+            <w:proofErr w:type="spellStart"/>
             <w:r>
               <w:rPr>
                 <w:b/>
@@ -5800,6 +5893,7 @@
               </w:rPr>
               <w:t>genes_DE_MAE</w:t>
             </w:r>
+            <w:proofErr w:type="spellEnd"/>
           </w:p>
         </w:tc>
         <w:tc>
@@ -5830,6 +5924,7 @@
                 <w:szCs w:val="22"/>
               </w:rPr>
             </w:pPr>
+            <w:proofErr w:type="spellStart"/>
             <w:r>
               <w:rPr>
                 <w:b/>
@@ -5840,6 +5935,7 @@
               </w:rPr>
               <w:t>genes_PR_MAE</w:t>
             </w:r>
+            <w:proofErr w:type="spellEnd"/>
           </w:p>
         </w:tc>
         <w:tc>
@@ -5870,6 +5966,7 @@
                 <w:szCs w:val="22"/>
               </w:rPr>
             </w:pPr>
+            <w:proofErr w:type="spellStart"/>
             <w:r>
               <w:rPr>
                 <w:b/>
@@ -5880,6 +5977,7 @@
               </w:rPr>
               <w:t>pathways_DE_MAE</w:t>
             </w:r>
+            <w:proofErr w:type="spellEnd"/>
           </w:p>
         </w:tc>
         <w:tc>
@@ -5910,6 +6008,7 @@
                 <w:szCs w:val="22"/>
               </w:rPr>
             </w:pPr>
+            <w:proofErr w:type="spellStart"/>
             <w:r>
               <w:rPr>
                 <w:b/>
@@ -5920,6 +6019,7 @@
               </w:rPr>
               <w:t>pathways_PR_MAE</w:t>
             </w:r>
+            <w:proofErr w:type="spellEnd"/>
           </w:p>
         </w:tc>
       </w:tr>
@@ -5979,6 +6079,7 @@
               <w:bottom w:w="72" w:type="dxa"/>
               <w:right w:w="144" w:type="dxa"/>
             </w:tcMar>
+            <w:vAlign w:val="center"/>
             <w:hideMark/>
           </w:tcPr>
           <w:p>
@@ -5992,10 +6093,12 @@
             </w:pPr>
             <w:r>
               <w:rPr>
-                <w:sz w:val="22"/>
-                <w:szCs w:val="22"/>
-              </w:rPr>
-              <w:t>0.73</w:t>
+                <w:rFonts w:ascii="Aptos" w:hAnsi="Aptos" w:cs="Arial"/>
+                <w:kern w:val="24"/>
+                <w:sz w:val="22"/>
+                <w:szCs w:val="22"/>
+              </w:rPr>
+              <w:t>0.568602</w:t>
             </w:r>
           </w:p>
         </w:tc>
@@ -6015,6 +6118,7 @@
               <w:bottom w:w="72" w:type="dxa"/>
               <w:right w:w="144" w:type="dxa"/>
             </w:tcMar>
+            <w:vAlign w:val="center"/>
             <w:hideMark/>
           </w:tcPr>
           <w:p>
@@ -6028,17 +6132,12 @@
             </w:pPr>
             <w:r>
               <w:rPr>
-                <w:sz w:val="22"/>
-                <w:szCs w:val="22"/>
-              </w:rPr>
-              <w:t>0.03</w:t>
-            </w:r>
-            <w:r>
-              <w:rPr>
-                <w:sz w:val="22"/>
-                <w:szCs w:val="22"/>
-              </w:rPr>
-              <w:t>3</w:t>
+                <w:rFonts w:ascii="Aptos" w:hAnsi="Aptos" w:cs="Arial"/>
+                <w:kern w:val="24"/>
+                <w:sz w:val="22"/>
+                <w:szCs w:val="22"/>
+              </w:rPr>
+              <w:t>0.047347</w:t>
             </w:r>
           </w:p>
         </w:tc>
@@ -6058,6 +6157,7 @@
               <w:bottom w:w="72" w:type="dxa"/>
               <w:right w:w="144" w:type="dxa"/>
             </w:tcMar>
+            <w:vAlign w:val="center"/>
             <w:hideMark/>
           </w:tcPr>
           <w:p>
@@ -6071,10 +6171,12 @@
             </w:pPr>
             <w:r>
               <w:rPr>
-                <w:sz w:val="22"/>
-                <w:szCs w:val="22"/>
-              </w:rPr>
-              <w:t>0.63</w:t>
+                <w:rFonts w:ascii="Aptos" w:hAnsi="Aptos" w:cs="Arial"/>
+                <w:kern w:val="24"/>
+                <w:sz w:val="22"/>
+                <w:szCs w:val="22"/>
+              </w:rPr>
+              <w:t>0.630935</w:t>
             </w:r>
           </w:p>
         </w:tc>
@@ -6094,6 +6196,7 @@
               <w:bottom w:w="72" w:type="dxa"/>
               <w:right w:w="144" w:type="dxa"/>
             </w:tcMar>
+            <w:vAlign w:val="center"/>
             <w:hideMark/>
           </w:tcPr>
           <w:p>
@@ -6107,17 +6210,12 @@
             </w:pPr>
             <w:r>
               <w:rPr>
-                <w:sz w:val="22"/>
-                <w:szCs w:val="22"/>
-              </w:rPr>
-              <w:t>0.03</w:t>
-            </w:r>
-            <w:r>
-              <w:rPr>
-                <w:sz w:val="22"/>
-                <w:szCs w:val="22"/>
-              </w:rPr>
-              <w:t>7</w:t>
+                <w:rFonts w:ascii="Aptos" w:hAnsi="Aptos" w:cs="Arial"/>
+                <w:kern w:val="24"/>
+                <w:sz w:val="22"/>
+                <w:szCs w:val="22"/>
+              </w:rPr>
+              <w:t>0.036782</w:t>
             </w:r>
           </w:p>
         </w:tc>
@@ -6178,6 +6276,7 @@
               <w:bottom w:w="72" w:type="dxa"/>
               <w:right w:w="144" w:type="dxa"/>
             </w:tcMar>
+            <w:vAlign w:val="center"/>
             <w:hideMark/>
           </w:tcPr>
           <w:p>
@@ -6191,10 +6290,12 @@
             </w:pPr>
             <w:r>
               <w:rPr>
-                <w:sz w:val="22"/>
-                <w:szCs w:val="22"/>
-              </w:rPr>
-              <w:t>0.50</w:t>
+                <w:rFonts w:ascii="Aptos" w:hAnsi="Aptos" w:cs="Arial"/>
+                <w:kern w:val="24"/>
+                <w:sz w:val="22"/>
+                <w:szCs w:val="22"/>
+              </w:rPr>
+              <w:t>0.404805</w:t>
             </w:r>
           </w:p>
         </w:tc>
@@ -6214,6 +6315,7 @@
               <w:bottom w:w="72" w:type="dxa"/>
               <w:right w:w="144" w:type="dxa"/>
             </w:tcMar>
+            <w:vAlign w:val="center"/>
             <w:hideMark/>
           </w:tcPr>
           <w:p>
@@ -6227,17 +6329,12 @@
             </w:pPr>
             <w:r>
               <w:rPr>
-                <w:sz w:val="22"/>
-                <w:szCs w:val="22"/>
-              </w:rPr>
-              <w:t>0.01</w:t>
-            </w:r>
-            <w:r>
-              <w:rPr>
-                <w:sz w:val="22"/>
-                <w:szCs w:val="22"/>
-              </w:rPr>
-              <w:t>7</w:t>
+                <w:rFonts w:ascii="Aptos" w:hAnsi="Aptos" w:cs="Arial"/>
+                <w:kern w:val="24"/>
+                <w:sz w:val="22"/>
+                <w:szCs w:val="22"/>
+              </w:rPr>
+              <w:t>0.016204</w:t>
             </w:r>
           </w:p>
         </w:tc>
@@ -6257,6 +6354,7 @@
               <w:bottom w:w="72" w:type="dxa"/>
               <w:right w:w="144" w:type="dxa"/>
             </w:tcMar>
+            <w:vAlign w:val="center"/>
             <w:hideMark/>
           </w:tcPr>
           <w:p>
@@ -6270,17 +6368,12 @@
             </w:pPr>
             <w:r>
               <w:rPr>
-                <w:sz w:val="22"/>
-                <w:szCs w:val="22"/>
-              </w:rPr>
-              <w:t>0.4</w:t>
-            </w:r>
-            <w:r>
-              <w:rPr>
-                <w:sz w:val="22"/>
-                <w:szCs w:val="22"/>
-              </w:rPr>
-              <w:t>8</w:t>
+                <w:rFonts w:ascii="Aptos" w:hAnsi="Aptos" w:cs="Arial"/>
+                <w:kern w:val="24"/>
+                <w:sz w:val="22"/>
+                <w:szCs w:val="22"/>
+              </w:rPr>
+              <w:t>0.477658</w:t>
             </w:r>
           </w:p>
         </w:tc>
@@ -6300,6 +6393,7 @@
               <w:bottom w:w="72" w:type="dxa"/>
               <w:right w:w="144" w:type="dxa"/>
             </w:tcMar>
+            <w:vAlign w:val="center"/>
             <w:hideMark/>
           </w:tcPr>
           <w:p>
@@ -6313,10 +6407,12 @@
             </w:pPr>
             <w:r>
               <w:rPr>
-                <w:sz w:val="22"/>
-                <w:szCs w:val="22"/>
-              </w:rPr>
-              <w:t>0.020</w:t>
+                <w:rFonts w:ascii="Aptos" w:hAnsi="Aptos" w:cs="Arial"/>
+                <w:kern w:val="24"/>
+                <w:sz w:val="22"/>
+                <w:szCs w:val="22"/>
+              </w:rPr>
+              <w:t>0.020233</w:t>
             </w:r>
           </w:p>
         </w:tc>
@@ -6377,6 +6473,7 @@
               <w:bottom w:w="72" w:type="dxa"/>
               <w:right w:w="144" w:type="dxa"/>
             </w:tcMar>
+            <w:vAlign w:val="center"/>
             <w:hideMark/>
           </w:tcPr>
           <w:p>
@@ -6390,10 +6487,12 @@
             </w:pPr>
             <w:r>
               <w:rPr>
-                <w:sz w:val="22"/>
-                <w:szCs w:val="22"/>
-              </w:rPr>
-              <w:t>0.54</w:t>
+                <w:rFonts w:ascii="Aptos" w:hAnsi="Aptos" w:cs="Arial"/>
+                <w:kern w:val="24"/>
+                <w:sz w:val="22"/>
+                <w:szCs w:val="22"/>
+              </w:rPr>
+              <w:t>0.401236</w:t>
             </w:r>
           </w:p>
         </w:tc>
@@ -6413,6 +6512,7 @@
               <w:bottom w:w="72" w:type="dxa"/>
               <w:right w:w="144" w:type="dxa"/>
             </w:tcMar>
+            <w:vAlign w:val="center"/>
             <w:hideMark/>
           </w:tcPr>
           <w:p>
@@ -6426,10 +6526,12 @@
             </w:pPr>
             <w:r>
               <w:rPr>
-                <w:sz w:val="22"/>
-                <w:szCs w:val="22"/>
-              </w:rPr>
-              <w:t>0.017</w:t>
+                <w:rFonts w:ascii="Aptos" w:hAnsi="Aptos" w:cs="Arial"/>
+                <w:kern w:val="24"/>
+                <w:sz w:val="22"/>
+                <w:szCs w:val="22"/>
+              </w:rPr>
+              <w:t>0.015706</w:t>
             </w:r>
           </w:p>
         </w:tc>
@@ -6449,6 +6551,7 @@
               <w:bottom w:w="72" w:type="dxa"/>
               <w:right w:w="144" w:type="dxa"/>
             </w:tcMar>
+            <w:vAlign w:val="center"/>
             <w:hideMark/>
           </w:tcPr>
           <w:p>
@@ -6462,10 +6565,12 @@
             </w:pPr>
             <w:r>
               <w:rPr>
-                <w:sz w:val="22"/>
-                <w:szCs w:val="22"/>
-              </w:rPr>
-              <w:t>0.47</w:t>
+                <w:rFonts w:ascii="Aptos" w:hAnsi="Aptos" w:cs="Arial"/>
+                <w:kern w:val="24"/>
+                <w:sz w:val="22"/>
+                <w:szCs w:val="22"/>
+              </w:rPr>
+              <w:t>0.474108</w:t>
             </w:r>
           </w:p>
         </w:tc>
@@ -6485,6 +6590,7 @@
               <w:bottom w:w="72" w:type="dxa"/>
               <w:right w:w="144" w:type="dxa"/>
             </w:tcMar>
+            <w:vAlign w:val="center"/>
             <w:hideMark/>
           </w:tcPr>
           <w:p>
@@ -6498,10 +6604,12 @@
             </w:pPr>
             <w:r>
               <w:rPr>
-                <w:sz w:val="22"/>
-                <w:szCs w:val="22"/>
-              </w:rPr>
-              <w:t>0.019</w:t>
+                <w:rFonts w:ascii="Aptos" w:hAnsi="Aptos" w:cs="Arial"/>
+                <w:kern w:val="24"/>
+                <w:sz w:val="22"/>
+                <w:szCs w:val="22"/>
+              </w:rPr>
+              <w:t>0.019064</w:t>
             </w:r>
           </w:p>
         </w:tc>
@@ -6537,12 +6645,21 @@
                 <w:szCs w:val="22"/>
               </w:rPr>
             </w:pPr>
+            <w:proofErr w:type="spellStart"/>
             <w:r>
               <w:rPr>
                 <w:sz w:val="22"/>
                 <w:szCs w:val="22"/>
               </w:rPr>
-              <w:t>XGBoost Regressor</w:t>
+              <w:t>XGBoost</w:t>
+            </w:r>
+            <w:proofErr w:type="spellEnd"/>
+            <w:r>
+              <w:rPr>
+                <w:sz w:val="22"/>
+                <w:szCs w:val="22"/>
+              </w:rPr>
+              <w:t xml:space="preserve"> Regressor</w:t>
             </w:r>
           </w:p>
         </w:tc>
@@ -6562,6 +6679,7 @@
               <w:bottom w:w="72" w:type="dxa"/>
               <w:right w:w="144" w:type="dxa"/>
             </w:tcMar>
+            <w:vAlign w:val="center"/>
             <w:hideMark/>
           </w:tcPr>
           <w:p>
@@ -6575,17 +6693,12 @@
             </w:pPr>
             <w:r>
               <w:rPr>
-                <w:sz w:val="22"/>
-                <w:szCs w:val="22"/>
-              </w:rPr>
-              <w:t>0.5</w:t>
-            </w:r>
-            <w:r>
-              <w:rPr>
-                <w:sz w:val="22"/>
-                <w:szCs w:val="22"/>
-              </w:rPr>
-              <w:t>4</w:t>
+                <w:rFonts w:ascii="Aptos" w:hAnsi="Aptos" w:cs="Arial"/>
+                <w:kern w:val="24"/>
+                <w:sz w:val="22"/>
+                <w:szCs w:val="22"/>
+              </w:rPr>
+              <w:t>0.456879</w:t>
             </w:r>
           </w:p>
         </w:tc>
@@ -6605,6 +6718,7 @@
               <w:bottom w:w="72" w:type="dxa"/>
               <w:right w:w="144" w:type="dxa"/>
             </w:tcMar>
+            <w:vAlign w:val="center"/>
             <w:hideMark/>
           </w:tcPr>
           <w:p>
@@ -6618,10 +6732,12 @@
             </w:pPr>
             <w:r>
               <w:rPr>
-                <w:sz w:val="22"/>
-                <w:szCs w:val="22"/>
-              </w:rPr>
-              <w:t>0.016</w:t>
+                <w:rFonts w:ascii="Aptos" w:hAnsi="Aptos" w:cs="Arial"/>
+                <w:kern w:val="24"/>
+                <w:sz w:val="22"/>
+                <w:szCs w:val="22"/>
+              </w:rPr>
+              <w:t>0.016859</w:t>
             </w:r>
           </w:p>
         </w:tc>
@@ -6641,6 +6757,7 @@
               <w:bottom w:w="72" w:type="dxa"/>
               <w:right w:w="144" w:type="dxa"/>
             </w:tcMar>
+            <w:vAlign w:val="center"/>
             <w:hideMark/>
           </w:tcPr>
           <w:p>
@@ -6654,10 +6771,12 @@
             </w:pPr>
             <w:r>
               <w:rPr>
-                <w:sz w:val="22"/>
-                <w:szCs w:val="22"/>
-              </w:rPr>
-              <w:t>0.53</w:t>
+                <w:rFonts w:ascii="Aptos" w:hAnsi="Aptos" w:cs="Arial"/>
+                <w:kern w:val="24"/>
+                <w:sz w:val="22"/>
+                <w:szCs w:val="22"/>
+              </w:rPr>
+              <w:t>0.532262</w:t>
             </w:r>
           </w:p>
         </w:tc>
@@ -6677,6 +6796,7 @@
               <w:bottom w:w="72" w:type="dxa"/>
               <w:right w:w="144" w:type="dxa"/>
             </w:tcMar>
+            <w:vAlign w:val="center"/>
             <w:hideMark/>
           </w:tcPr>
           <w:p>
@@ -6690,10 +6810,12 @@
             </w:pPr>
             <w:r>
               <w:rPr>
-                <w:sz w:val="22"/>
-                <w:szCs w:val="22"/>
-              </w:rPr>
-              <w:t>0.021</w:t>
+                <w:rFonts w:ascii="Aptos" w:hAnsi="Aptos" w:cs="Arial"/>
+                <w:kern w:val="24"/>
+                <w:sz w:val="22"/>
+                <w:szCs w:val="22"/>
+              </w:rPr>
+              <w:t>0.021314</w:t>
             </w:r>
           </w:p>
         </w:tc>
@@ -6754,6 +6876,7 @@
               <w:bottom w:w="72" w:type="dxa"/>
               <w:right w:w="144" w:type="dxa"/>
             </w:tcMar>
+            <w:vAlign w:val="center"/>
             <w:hideMark/>
           </w:tcPr>
           <w:p>
@@ -6767,17 +6890,12 @@
             </w:pPr>
             <w:r>
               <w:rPr>
-                <w:sz w:val="22"/>
-                <w:szCs w:val="22"/>
-              </w:rPr>
-              <w:t>0.</w:t>
-            </w:r>
-            <w:r>
-              <w:rPr>
-                <w:sz w:val="22"/>
-                <w:szCs w:val="22"/>
-              </w:rPr>
-              <w:t>50</w:t>
+                <w:rFonts w:ascii="Aptos" w:hAnsi="Aptos" w:cs="Arial"/>
+                <w:kern w:val="24"/>
+                <w:sz w:val="22"/>
+                <w:szCs w:val="22"/>
+              </w:rPr>
+              <w:t>0.410011</w:t>
             </w:r>
           </w:p>
         </w:tc>
@@ -6797,6 +6915,7 @@
               <w:bottom w:w="72" w:type="dxa"/>
               <w:right w:w="144" w:type="dxa"/>
             </w:tcMar>
+            <w:vAlign w:val="center"/>
             <w:hideMark/>
           </w:tcPr>
           <w:p>
@@ -6810,10 +6929,12 @@
             </w:pPr>
             <w:r>
               <w:rPr>
-                <w:sz w:val="22"/>
-                <w:szCs w:val="22"/>
-              </w:rPr>
-              <w:t>0.015</w:t>
+                <w:rFonts w:ascii="Aptos" w:hAnsi="Aptos" w:cs="Arial"/>
+                <w:kern w:val="24"/>
+                <w:sz w:val="22"/>
+                <w:szCs w:val="22"/>
+              </w:rPr>
+              <w:t>0.015049</w:t>
             </w:r>
           </w:p>
         </w:tc>
@@ -6833,6 +6954,7 @@
               <w:bottom w:w="72" w:type="dxa"/>
               <w:right w:w="144" w:type="dxa"/>
             </w:tcMar>
+            <w:vAlign w:val="center"/>
             <w:hideMark/>
           </w:tcPr>
           <w:p>
@@ -6846,10 +6968,12 @@
             </w:pPr>
             <w:r>
               <w:rPr>
-                <w:sz w:val="22"/>
-                <w:szCs w:val="22"/>
-              </w:rPr>
-              <w:t>0.51</w:t>
+                <w:rFonts w:ascii="Aptos" w:hAnsi="Aptos" w:cs="Arial"/>
+                <w:kern w:val="24"/>
+                <w:sz w:val="22"/>
+                <w:szCs w:val="22"/>
+              </w:rPr>
+              <w:t>0.510991</w:t>
             </w:r>
           </w:p>
         </w:tc>
@@ -6869,6 +6993,7 @@
               <w:bottom w:w="72" w:type="dxa"/>
               <w:right w:w="144" w:type="dxa"/>
             </w:tcMar>
+            <w:vAlign w:val="center"/>
             <w:hideMark/>
           </w:tcPr>
           <w:p>
@@ -6882,10 +7007,12 @@
             </w:pPr>
             <w:r>
               <w:rPr>
-                <w:sz w:val="22"/>
-                <w:szCs w:val="22"/>
-              </w:rPr>
-              <w:t>0.019</w:t>
+                <w:rFonts w:ascii="Aptos" w:hAnsi="Aptos" w:cs="Arial"/>
+                <w:kern w:val="24"/>
+                <w:sz w:val="22"/>
+                <w:szCs w:val="22"/>
+              </w:rPr>
+              <w:t>0.019033</w:t>
             </w:r>
           </w:p>
         </w:tc>
@@ -6915,19 +7042,92 @@
         </w:rPr>
         <w:t xml:space="preserve"> MAE for learners trained with </w:t>
       </w:r>
+      <w:proofErr w:type="spellStart"/>
       <w:r>
         <w:rPr>
           <w:sz w:val="22"/>
           <w:szCs w:val="22"/>
         </w:rPr>
-        <w:t>donor_score (genes_DE), donor_rank (genes_PR)</w:t>
-      </w:r>
+        <w:t>donor_score</w:t>
+      </w:r>
+      <w:proofErr w:type="spellEnd"/>
       <w:r>
         <w:rPr>
           <w:sz w:val="22"/>
           <w:szCs w:val="22"/>
         </w:rPr>
-        <w:t xml:space="preserve"> or donor_pathways to predict DE score (DE) or Pseudorank (PR).</w:t>
+        <w:t xml:space="preserve"> (</w:t>
+      </w:r>
+      <w:proofErr w:type="spellStart"/>
+      <w:r>
+        <w:rPr>
+          <w:sz w:val="22"/>
+          <w:szCs w:val="22"/>
+        </w:rPr>
+        <w:t>genes_DE</w:t>
+      </w:r>
+      <w:proofErr w:type="spellEnd"/>
+      <w:r>
+        <w:rPr>
+          <w:sz w:val="22"/>
+          <w:szCs w:val="22"/>
+        </w:rPr>
+        <w:t xml:space="preserve">), </w:t>
+      </w:r>
+      <w:proofErr w:type="spellStart"/>
+      <w:r>
+        <w:rPr>
+          <w:sz w:val="22"/>
+          <w:szCs w:val="22"/>
+        </w:rPr>
+        <w:t>donor_rank</w:t>
+      </w:r>
+      <w:proofErr w:type="spellEnd"/>
+      <w:r>
+        <w:rPr>
+          <w:sz w:val="22"/>
+          <w:szCs w:val="22"/>
+        </w:rPr>
+        <w:t xml:space="preserve"> (</w:t>
+      </w:r>
+      <w:proofErr w:type="spellStart"/>
+      <w:r>
+        <w:rPr>
+          <w:sz w:val="22"/>
+          <w:szCs w:val="22"/>
+        </w:rPr>
+        <w:t>genes_PR</w:t>
+      </w:r>
+      <w:proofErr w:type="spellEnd"/>
+      <w:r>
+        <w:rPr>
+          <w:sz w:val="22"/>
+          <w:szCs w:val="22"/>
+        </w:rPr>
+        <w:t>)</w:t>
+      </w:r>
+      <w:r>
+        <w:rPr>
+          <w:sz w:val="22"/>
+          <w:szCs w:val="22"/>
+        </w:rPr>
+        <w:t xml:space="preserve"> or </w:t>
+      </w:r>
+      <w:proofErr w:type="spellStart"/>
+      <w:r>
+        <w:rPr>
+          <w:sz w:val="22"/>
+          <w:szCs w:val="22"/>
+        </w:rPr>
+        <w:t>donor_pathways</w:t>
+      </w:r>
+      <w:proofErr w:type="spellEnd"/>
+      <w:r>
+        <w:rPr>
+          <w:sz w:val="22"/>
+          <w:szCs w:val="22"/>
+        </w:rPr>
+        <w:t xml:space="preserve"> to predict DE score (DE) or Pseudorank (PR).</w:t>
       </w:r>
     </w:p>
     <w:tbl>
@@ -7021,6 +7221,7 @@
                 <w:szCs w:val="22"/>
               </w:rPr>
             </w:pPr>
+            <w:proofErr w:type="spellStart"/>
             <w:r>
               <w:rPr>
                 <w:b/>
@@ -7031,6 +7232,7 @@
               </w:rPr>
               <w:t>genes_DE_MAPE</w:t>
             </w:r>
+            <w:proofErr w:type="spellEnd"/>
           </w:p>
         </w:tc>
         <w:tc>
@@ -7062,6 +7264,7 @@
                 <w:szCs w:val="22"/>
               </w:rPr>
             </w:pPr>
+            <w:proofErr w:type="spellStart"/>
             <w:r>
               <w:rPr>
                 <w:b/>
@@ -7072,6 +7275,7 @@
               </w:rPr>
               <w:t>genes_PR_MAPE</w:t>
             </w:r>
+            <w:proofErr w:type="spellEnd"/>
           </w:p>
         </w:tc>
         <w:tc>
@@ -7105,6 +7309,7 @@
                 <w:szCs w:val="22"/>
               </w:rPr>
             </w:pPr>
+            <w:proofErr w:type="spellStart"/>
             <w:r>
               <w:rPr>
                 <w:b/>
@@ -7113,7 +7318,18 @@
                 <w:sz w:val="22"/>
                 <w:szCs w:val="22"/>
               </w:rPr>
-              <w:t>pathways_DE_</w:t>
+              <w:t>pathways_DE</w:t>
+            </w:r>
+            <w:proofErr w:type="spellEnd"/>
+            <w:r>
+              <w:rPr>
+                <w:b/>
+                <w:bCs/>
+                <w:color w:val="FFFFFF" w:themeColor="background1"/>
+                <w:sz w:val="22"/>
+                <w:szCs w:val="22"/>
+              </w:rPr>
+              <w:t>_</w:t>
             </w:r>
           </w:p>
           <w:p>
@@ -7169,6 +7385,7 @@
                 <w:szCs w:val="22"/>
               </w:rPr>
             </w:pPr>
+            <w:proofErr w:type="spellStart"/>
             <w:r>
               <w:rPr>
                 <w:b/>
@@ -7177,7 +7394,18 @@
                 <w:sz w:val="22"/>
                 <w:szCs w:val="22"/>
               </w:rPr>
-              <w:t>pathways_PR_</w:t>
+              <w:t>pathways_PR</w:t>
+            </w:r>
+            <w:proofErr w:type="spellEnd"/>
+            <w:r>
+              <w:rPr>
+                <w:b/>
+                <w:bCs/>
+                <w:color w:val="FFFFFF" w:themeColor="background1"/>
+                <w:sz w:val="22"/>
+                <w:szCs w:val="22"/>
+              </w:rPr>
+              <w:t>_</w:t>
             </w:r>
           </w:p>
           <w:p>
@@ -7259,6 +7487,7 @@
               <w:bottom w:w="72" w:type="dxa"/>
               <w:right w:w="144" w:type="dxa"/>
             </w:tcMar>
+            <w:vAlign w:val="center"/>
             <w:hideMark/>
           </w:tcPr>
           <w:p>
@@ -7272,10 +7501,12 @@
             </w:pPr>
             <w:r>
               <w:rPr>
-                <w:sz w:val="22"/>
-                <w:szCs w:val="22"/>
-              </w:rPr>
-              <w:t>0.278879</w:t>
+                <w:rFonts w:ascii="Aptos" w:hAnsi="Aptos" w:cs="Arial"/>
+                <w:kern w:val="24"/>
+                <w:sz w:val="22"/>
+                <w:szCs w:val="22"/>
+              </w:rPr>
+              <w:t>0.204038</w:t>
             </w:r>
           </w:p>
         </w:tc>
@@ -7295,6 +7526,7 @@
               <w:bottom w:w="72" w:type="dxa"/>
               <w:right w:w="144" w:type="dxa"/>
             </w:tcMar>
+            <w:vAlign w:val="center"/>
             <w:hideMark/>
           </w:tcPr>
           <w:p>
@@ -7308,10 +7540,12 @@
             </w:pPr>
             <w:r>
               <w:rPr>
-                <w:sz w:val="22"/>
-                <w:szCs w:val="22"/>
-              </w:rPr>
-              <w:t>0.042867</w:t>
+                <w:rFonts w:ascii="Aptos" w:hAnsi="Aptos" w:cs="Arial"/>
+                <w:kern w:val="24"/>
+                <w:sz w:val="22"/>
+                <w:szCs w:val="22"/>
+              </w:rPr>
+              <w:t>0.062277</w:t>
             </w:r>
           </w:p>
         </w:tc>
@@ -7331,6 +7565,7 @@
               <w:bottom w:w="72" w:type="dxa"/>
               <w:right w:w="144" w:type="dxa"/>
             </w:tcMar>
+            <w:vAlign w:val="center"/>
             <w:hideMark/>
           </w:tcPr>
           <w:p>
@@ -7344,6 +7579,8 @@
             </w:pPr>
             <w:r>
               <w:rPr>
+                <w:rFonts w:ascii="Aptos" w:hAnsi="Aptos" w:cs="Arial"/>
+                <w:kern w:val="24"/>
                 <w:sz w:val="22"/>
                 <w:szCs w:val="22"/>
               </w:rPr>
@@ -7367,6 +7604,7 @@
               <w:bottom w:w="72" w:type="dxa"/>
               <w:right w:w="144" w:type="dxa"/>
             </w:tcMar>
+            <w:vAlign w:val="center"/>
             <w:hideMark/>
           </w:tcPr>
           <w:p>
@@ -7380,6 +7618,8 @@
             </w:pPr>
             <w:r>
               <w:rPr>
+                <w:rFonts w:ascii="Aptos" w:hAnsi="Aptos" w:cs="Arial"/>
+                <w:kern w:val="24"/>
                 <w:sz w:val="22"/>
                 <w:szCs w:val="22"/>
               </w:rPr>
@@ -7444,6 +7684,7 @@
               <w:bottom w:w="72" w:type="dxa"/>
               <w:right w:w="144" w:type="dxa"/>
             </w:tcMar>
+            <w:vAlign w:val="center"/>
             <w:hideMark/>
           </w:tcPr>
           <w:p>
@@ -7457,10 +7698,12 @@
             </w:pPr>
             <w:r>
               <w:rPr>
-                <w:sz w:val="22"/>
-                <w:szCs w:val="22"/>
-              </w:rPr>
-              <w:t>0.220917</w:t>
+                <w:rFonts w:ascii="Aptos" w:hAnsi="Aptos" w:cs="Arial"/>
+                <w:kern w:val="24"/>
+                <w:sz w:val="22"/>
+                <w:szCs w:val="22"/>
+              </w:rPr>
+              <w:t>0.151211</w:t>
             </w:r>
           </w:p>
         </w:tc>
@@ -7480,6 +7723,7 @@
               <w:bottom w:w="72" w:type="dxa"/>
               <w:right w:w="144" w:type="dxa"/>
             </w:tcMar>
+            <w:vAlign w:val="center"/>
             <w:hideMark/>
           </w:tcPr>
           <w:p>
@@ -7493,10 +7737,12 @@
             </w:pPr>
             <w:r>
               <w:rPr>
-                <w:sz w:val="22"/>
-                <w:szCs w:val="22"/>
-              </w:rPr>
-              <w:t>0.022109</w:t>
+                <w:rFonts w:ascii="Aptos" w:hAnsi="Aptos" w:cs="Arial"/>
+                <w:kern w:val="24"/>
+                <w:sz w:val="22"/>
+                <w:szCs w:val="22"/>
+              </w:rPr>
+              <w:t>0.021715</w:t>
             </w:r>
           </w:p>
         </w:tc>
@@ -7516,6 +7762,7 @@
               <w:bottom w:w="72" w:type="dxa"/>
               <w:right w:w="144" w:type="dxa"/>
             </w:tcMar>
+            <w:vAlign w:val="center"/>
             <w:hideMark/>
           </w:tcPr>
           <w:p>
@@ -7529,6 +7776,8 @@
             </w:pPr>
             <w:r>
               <w:rPr>
+                <w:rFonts w:ascii="Aptos" w:hAnsi="Aptos" w:cs="Arial"/>
+                <w:kern w:val="24"/>
                 <w:sz w:val="22"/>
                 <w:szCs w:val="22"/>
               </w:rPr>
@@ -7552,6 +7801,7 @@
               <w:bottom w:w="72" w:type="dxa"/>
               <w:right w:w="144" w:type="dxa"/>
             </w:tcMar>
+            <w:vAlign w:val="center"/>
             <w:hideMark/>
           </w:tcPr>
           <w:p>
@@ -7565,6 +7815,8 @@
             </w:pPr>
             <w:r>
               <w:rPr>
+                <w:rFonts w:ascii="Aptos" w:hAnsi="Aptos" w:cs="Arial"/>
+                <w:kern w:val="24"/>
                 <w:sz w:val="22"/>
                 <w:szCs w:val="22"/>
               </w:rPr>
@@ -7629,6 +7881,7 @@
               <w:bottom w:w="72" w:type="dxa"/>
               <w:right w:w="144" w:type="dxa"/>
             </w:tcMar>
+            <w:vAlign w:val="center"/>
             <w:hideMark/>
           </w:tcPr>
           <w:p>
@@ -7642,10 +7895,12 @@
             </w:pPr>
             <w:r>
               <w:rPr>
-                <w:sz w:val="22"/>
-                <w:szCs w:val="22"/>
-              </w:rPr>
-              <w:t>0.233837</w:t>
+                <w:rFonts w:ascii="Aptos" w:hAnsi="Aptos" w:cs="Arial"/>
+                <w:kern w:val="24"/>
+                <w:sz w:val="22"/>
+                <w:szCs w:val="22"/>
+              </w:rPr>
+              <w:t>0.150670</w:t>
             </w:r>
           </w:p>
         </w:tc>
@@ -7665,6 +7920,7 @@
               <w:bottom w:w="72" w:type="dxa"/>
               <w:right w:w="144" w:type="dxa"/>
             </w:tcMar>
+            <w:vAlign w:val="center"/>
             <w:hideMark/>
           </w:tcPr>
           <w:p>
@@ -7678,10 +7934,12 @@
             </w:pPr>
             <w:r>
               <w:rPr>
-                <w:sz w:val="22"/>
-                <w:szCs w:val="22"/>
-              </w:rPr>
-              <w:t>0.023144</w:t>
+                <w:rFonts w:ascii="Aptos" w:hAnsi="Aptos" w:cs="Arial"/>
+                <w:kern w:val="24"/>
+                <w:sz w:val="22"/>
+                <w:szCs w:val="22"/>
+              </w:rPr>
+              <w:t>0.021009</w:t>
             </w:r>
           </w:p>
         </w:tc>
@@ -7701,6 +7959,7 @@
               <w:bottom w:w="72" w:type="dxa"/>
               <w:right w:w="144" w:type="dxa"/>
             </w:tcMar>
+            <w:vAlign w:val="center"/>
             <w:hideMark/>
           </w:tcPr>
           <w:p>
@@ -7714,6 +7973,8 @@
             </w:pPr>
             <w:r>
               <w:rPr>
+                <w:rFonts w:ascii="Aptos" w:hAnsi="Aptos" w:cs="Arial"/>
+                <w:kern w:val="24"/>
                 <w:sz w:val="22"/>
                 <w:szCs w:val="22"/>
               </w:rPr>
@@ -7737,6 +7998,7 @@
               <w:bottom w:w="72" w:type="dxa"/>
               <w:right w:w="144" w:type="dxa"/>
             </w:tcMar>
+            <w:vAlign w:val="center"/>
             <w:hideMark/>
           </w:tcPr>
           <w:p>
@@ -7750,6 +8012,8 @@
             </w:pPr>
             <w:r>
               <w:rPr>
+                <w:rFonts w:ascii="Aptos" w:hAnsi="Aptos" w:cs="Arial"/>
+                <w:kern w:val="24"/>
                 <w:sz w:val="22"/>
                 <w:szCs w:val="22"/>
               </w:rPr>
@@ -7789,12 +8053,21 @@
                 <w:szCs w:val="22"/>
               </w:rPr>
             </w:pPr>
+            <w:proofErr w:type="spellStart"/>
             <w:r>
               <w:rPr>
                 <w:sz w:val="22"/>
                 <w:szCs w:val="22"/>
               </w:rPr>
-              <w:t>XGBoost Regressor</w:t>
+              <w:t>XGBoost</w:t>
+            </w:r>
+            <w:proofErr w:type="spellEnd"/>
+            <w:r>
+              <w:rPr>
+                <w:sz w:val="22"/>
+                <w:szCs w:val="22"/>
+              </w:rPr>
+              <w:t xml:space="preserve"> Regressor</w:t>
             </w:r>
           </w:p>
         </w:tc>
@@ -7814,6 +8087,7 @@
               <w:bottom w:w="72" w:type="dxa"/>
               <w:right w:w="144" w:type="dxa"/>
             </w:tcMar>
+            <w:vAlign w:val="center"/>
             <w:hideMark/>
           </w:tcPr>
           <w:p>
@@ -7827,10 +8101,12 @@
             </w:pPr>
             <w:r>
               <w:rPr>
-                <w:sz w:val="22"/>
-                <w:szCs w:val="22"/>
-              </w:rPr>
-              <w:t>0.229096</w:t>
+                <w:rFonts w:ascii="Aptos" w:hAnsi="Aptos" w:cs="Arial"/>
+                <w:kern w:val="24"/>
+                <w:sz w:val="22"/>
+                <w:szCs w:val="22"/>
+              </w:rPr>
+              <w:t>0.173794</w:t>
             </w:r>
           </w:p>
         </w:tc>
@@ -7850,6 +8126,7 @@
               <w:bottom w:w="72" w:type="dxa"/>
               <w:right w:w="144" w:type="dxa"/>
             </w:tcMar>
+            <w:vAlign w:val="center"/>
             <w:hideMark/>
           </w:tcPr>
           <w:p>
@@ -7863,10 +8140,12 @@
             </w:pPr>
             <w:r>
               <w:rPr>
-                <w:sz w:val="22"/>
-                <w:szCs w:val="22"/>
-              </w:rPr>
-              <w:t>0.021817</w:t>
+                <w:rFonts w:ascii="Aptos" w:hAnsi="Aptos" w:cs="Arial"/>
+                <w:kern w:val="24"/>
+                <w:sz w:val="22"/>
+                <w:szCs w:val="22"/>
+              </w:rPr>
+              <w:t>0.022656</w:t>
             </w:r>
           </w:p>
         </w:tc>
@@ -7886,6 +8165,7 @@
               <w:bottom w:w="72" w:type="dxa"/>
               <w:right w:w="144" w:type="dxa"/>
             </w:tcMar>
+            <w:vAlign w:val="center"/>
             <w:hideMark/>
           </w:tcPr>
           <w:p>
@@ -7899,6 +8179,8 @@
             </w:pPr>
             <w:r>
               <w:rPr>
+                <w:rFonts w:ascii="Aptos" w:hAnsi="Aptos" w:cs="Arial"/>
+                <w:kern w:val="24"/>
                 <w:sz w:val="22"/>
                 <w:szCs w:val="22"/>
               </w:rPr>
@@ -7922,6 +8204,7 @@
               <w:bottom w:w="72" w:type="dxa"/>
               <w:right w:w="144" w:type="dxa"/>
             </w:tcMar>
+            <w:vAlign w:val="center"/>
             <w:hideMark/>
           </w:tcPr>
           <w:p>
@@ -7935,6 +8218,8 @@
             </w:pPr>
             <w:r>
               <w:rPr>
+                <w:rFonts w:ascii="Aptos" w:hAnsi="Aptos" w:cs="Arial"/>
+                <w:kern w:val="24"/>
                 <w:sz w:val="22"/>
                 <w:szCs w:val="22"/>
               </w:rPr>
@@ -7999,6 +8284,7 @@
               <w:bottom w:w="72" w:type="dxa"/>
               <w:right w:w="144" w:type="dxa"/>
             </w:tcMar>
+            <w:vAlign w:val="center"/>
             <w:hideMark/>
           </w:tcPr>
           <w:p>
@@ -8012,10 +8298,12 @@
             </w:pPr>
             <w:r>
               <w:rPr>
-                <w:sz w:val="22"/>
-                <w:szCs w:val="22"/>
-              </w:rPr>
-              <w:t>0.217116</w:t>
+                <w:rFonts w:ascii="Aptos" w:hAnsi="Aptos" w:cs="Arial"/>
+                <w:kern w:val="24"/>
+                <w:sz w:val="22"/>
+                <w:szCs w:val="22"/>
+              </w:rPr>
+              <w:t>0.153956</w:t>
             </w:r>
           </w:p>
         </w:tc>
@@ -8035,6 +8323,7 @@
               <w:bottom w:w="72" w:type="dxa"/>
               <w:right w:w="144" w:type="dxa"/>
             </w:tcMar>
+            <w:vAlign w:val="center"/>
             <w:hideMark/>
           </w:tcPr>
           <w:p>
@@ -8048,10 +8337,12 @@
             </w:pPr>
             <w:r>
               <w:rPr>
-                <w:sz w:val="22"/>
-                <w:szCs w:val="22"/>
-              </w:rPr>
-              <w:t>0.020755</w:t>
+                <w:rFonts w:ascii="Aptos" w:hAnsi="Aptos" w:cs="Arial"/>
+                <w:kern w:val="24"/>
+                <w:sz w:val="22"/>
+                <w:szCs w:val="22"/>
+              </w:rPr>
+              <w:t>0.020189</w:t>
             </w:r>
           </w:p>
         </w:tc>
@@ -8071,6 +8362,7 @@
               <w:bottom w:w="72" w:type="dxa"/>
               <w:right w:w="144" w:type="dxa"/>
             </w:tcMar>
+            <w:vAlign w:val="center"/>
             <w:hideMark/>
           </w:tcPr>
           <w:p>
@@ -8084,6 +8376,8 @@
             </w:pPr>
             <w:r>
               <w:rPr>
+                <w:rFonts w:ascii="Aptos" w:hAnsi="Aptos" w:cs="Arial"/>
+                <w:kern w:val="24"/>
                 <w:sz w:val="22"/>
                 <w:szCs w:val="22"/>
               </w:rPr>
@@ -8107,6 +8401,7 @@
               <w:bottom w:w="72" w:type="dxa"/>
               <w:right w:w="144" w:type="dxa"/>
             </w:tcMar>
+            <w:vAlign w:val="center"/>
             <w:hideMark/>
           </w:tcPr>
           <w:p>
@@ -8120,6 +8415,8 @@
             </w:pPr>
             <w:r>
               <w:rPr>
+                <w:rFonts w:ascii="Aptos" w:hAnsi="Aptos" w:cs="Arial"/>
+                <w:kern w:val="24"/>
                 <w:sz w:val="22"/>
                 <w:szCs w:val="22"/>
               </w:rPr>
@@ -8169,21 +8466,87 @@
           <w:sz w:val="22"/>
           <w:szCs w:val="22"/>
         </w:rPr>
-        <w:t xml:space="preserve"> MA</w:t>
-      </w:r>
+        <w:t xml:space="preserve"> MAPE for learners trained with </w:t>
+      </w:r>
+      <w:proofErr w:type="spellStart"/>
       <w:r>
         <w:rPr>
           <w:sz w:val="22"/>
           <w:szCs w:val="22"/>
         </w:rPr>
-        <w:t>P</w:t>
-      </w:r>
+        <w:t>donor_score</w:t>
+      </w:r>
+      <w:proofErr w:type="spellEnd"/>
       <w:r>
         <w:rPr>
           <w:sz w:val="22"/>
           <w:szCs w:val="22"/>
         </w:rPr>
-        <w:t>E for learners trained with donor_score (genes_DE), donor_rank (genes_PR) or donor_pathways to predict DE score (DE) or Pseudorank (PR).</w:t>
+        <w:t xml:space="preserve"> (</w:t>
+      </w:r>
+      <w:proofErr w:type="spellStart"/>
+      <w:r>
+        <w:rPr>
+          <w:sz w:val="22"/>
+          <w:szCs w:val="22"/>
+        </w:rPr>
+        <w:t>genes_DE</w:t>
+      </w:r>
+      <w:proofErr w:type="spellEnd"/>
+      <w:r>
+        <w:rPr>
+          <w:sz w:val="22"/>
+          <w:szCs w:val="22"/>
+        </w:rPr>
+        <w:t xml:space="preserve">), </w:t>
+      </w:r>
+      <w:proofErr w:type="spellStart"/>
+      <w:r>
+        <w:rPr>
+          <w:sz w:val="22"/>
+          <w:szCs w:val="22"/>
+        </w:rPr>
+        <w:t>donor_rank</w:t>
+      </w:r>
+      <w:proofErr w:type="spellEnd"/>
+      <w:r>
+        <w:rPr>
+          <w:sz w:val="22"/>
+          <w:szCs w:val="22"/>
+        </w:rPr>
+        <w:t xml:space="preserve"> (</w:t>
+      </w:r>
+      <w:proofErr w:type="spellStart"/>
+      <w:r>
+        <w:rPr>
+          <w:sz w:val="22"/>
+          <w:szCs w:val="22"/>
+        </w:rPr>
+        <w:t>genes_PR</w:t>
+      </w:r>
+      <w:proofErr w:type="spellEnd"/>
+      <w:r>
+        <w:rPr>
+          <w:sz w:val="22"/>
+          <w:szCs w:val="22"/>
+        </w:rPr>
+        <w:t xml:space="preserve">) or </w:t>
+      </w:r>
+      <w:proofErr w:type="spellStart"/>
+      <w:r>
+        <w:rPr>
+          <w:sz w:val="22"/>
+          <w:szCs w:val="22"/>
+        </w:rPr>
+        <w:t>donor_pathways</w:t>
+      </w:r>
+      <w:proofErr w:type="spellEnd"/>
+      <w:r>
+        <w:rPr>
+          <w:sz w:val="22"/>
+          <w:szCs w:val="22"/>
+        </w:rPr>
+        <w:t xml:space="preserve"> to predict DE score (DE) or Pseudorank (PR).</w:t>
       </w:r>
     </w:p>
     <w:p>
@@ -8265,10 +8628,10 @@
           <w:noProof/>
         </w:rPr>
         <w:drawing>
-          <wp:inline distT="0" distB="0" distL="0" distR="0" wp14:anchorId="7210C558" wp14:editId="60E54C60">
-            <wp:extent cx="6492240" cy="3237230"/>
+          <wp:inline distT="0" distB="0" distL="0" distR="0" wp14:anchorId="3B08278D" wp14:editId="12EFA670">
+            <wp:extent cx="6492240" cy="3006090"/>
             <wp:effectExtent l="0" t="0" r="3810" b="0"/>
-            <wp:docPr id="1932268440" name="Picture 3"/>
+            <wp:docPr id="1240371224" name="Picture 1"/>
             <wp:cNvGraphicFramePr>
               <a:graphicFrameLocks xmlns:a="http://schemas.openxmlformats.org/drawingml/2006/main" noChangeAspect="1"/>
             </wp:cNvGraphicFramePr>
@@ -8276,7 +8639,7 @@
               <a:graphicData uri="http://schemas.openxmlformats.org/drawingml/2006/picture">
                 <pic:pic xmlns:pic="http://schemas.openxmlformats.org/drawingml/2006/picture">
                   <pic:nvPicPr>
-                    <pic:cNvPr id="1932268440" name="Picture 1932268440"/>
+                    <pic:cNvPr id="1240371224" name="Picture 1240371224"/>
                     <pic:cNvPicPr/>
                   </pic:nvPicPr>
                   <pic:blipFill>
@@ -8294,7 +8657,7 @@
                   <pic:spPr>
                     <a:xfrm>
                       <a:off x="0" y="0"/>
-                      <a:ext cx="6492240" cy="3237230"/>
+                      <a:ext cx="6492240" cy="3006090"/>
                     </a:xfrm>
                     <a:prstGeom prst="rect">
                       <a:avLst/>
@@ -8389,42 +8752,21 @@
         <w:t xml:space="preserve">. </w:t>
       </w:r>
       <w:r>
-        <w:t>T</w:t>
-      </w:r>
-      <w:r>
-        <w:t xml:space="preserve">hese results indicate that the CatBoost learner </w:t>
-      </w:r>
-      <w:r>
-        <w:t xml:space="preserve">trained to predict Pseudorank is </w:t>
-      </w:r>
-      <w:r>
-        <w:t xml:space="preserve">the </w:t>
-      </w:r>
-      <w:r>
-        <w:t>most successful at predicting donor order. As</w:t>
-      </w:r>
-      <w:r>
-        <w:t xml:space="preserve"> finding the top donors</w:t>
-      </w:r>
-      <w:r>
-        <w:t xml:space="preserve"> is likely to be the most </w:t>
-      </w:r>
-      <w:r>
-        <w:t>useful</w:t>
-      </w:r>
-      <w:r>
-        <w:t xml:space="preserve"> function of this model in practice, </w:t>
-      </w:r>
-      <w:r>
-        <w:t xml:space="preserve">optimization will continue with the CatBoost </w:t>
-      </w:r>
-      <w:r>
-        <w:t>Regressor</w:t>
-      </w:r>
-      <w:r>
-        <w:t xml:space="preserve"> predicting Pseudorank using top individual genes as features.</w:t>
+        <w:t>Random</w:t>
+      </w:r>
+      <w:r>
+        <w:t xml:space="preserve"> Forest and CatBoost </w:t>
+      </w:r>
+      <w:proofErr w:type="gramStart"/>
+      <w:r>
+        <w:t>learners</w:t>
+      </w:r>
+      <w:proofErr w:type="gramEnd"/>
+      <w:r>
+        <w:t xml:space="preserve"> places donors an average of 2.5 ranks away from their actual rank and got the top two donors correct.  However, CatBoost had slightly better Spearman and Kendall Coefficients and did better at ordering donors over different splits lead us to select CatBoost as our learner for the final model.</w:t>
       </w:r>
     </w:p>
+    <w:p/>
     <w:tbl>
       <w:tblPr>
         <w:tblW w:w="0" w:type="auto"/>
@@ -8681,42 +9023,6 @@
                 <w:sz w:val="22"/>
                 <w:szCs w:val="22"/>
               </w:rPr>
-              <w:t>1</w:t>
-            </w:r>
-          </w:p>
-        </w:tc>
-        <w:tc>
-          <w:tcPr>
-            <w:tcW w:w="0" w:type="auto"/>
-            <w:tcBorders>
-              <w:top w:val="single" w:sz="24" w:space="0" w:color="FFFFFF"/>
-              <w:left w:val="single" w:sz="8" w:space="0" w:color="FFFFFF"/>
-              <w:bottom w:val="single" w:sz="8" w:space="0" w:color="FFFFFF"/>
-              <w:right w:val="single" w:sz="8" w:space="0" w:color="FFFFFF"/>
-            </w:tcBorders>
-            <w:shd w:val="clear" w:color="auto" w:fill="CCD2D8"/>
-            <w:tcMar>
-              <w:top w:w="72" w:type="dxa"/>
-              <w:left w:w="144" w:type="dxa"/>
-              <w:bottom w:w="72" w:type="dxa"/>
-              <w:right w:w="144" w:type="dxa"/>
-            </w:tcMar>
-            <w:hideMark/>
-          </w:tcPr>
-          <w:p>
-            <w:pPr>
-              <w:spacing w:after="0"/>
-              <w:jc w:val="center"/>
-              <w:rPr>
-                <w:sz w:val="22"/>
-                <w:szCs w:val="22"/>
-              </w:rPr>
-            </w:pPr>
-            <w:r>
-              <w:rPr>
-                <w:sz w:val="22"/>
-                <w:szCs w:val="22"/>
-              </w:rPr>
               <w:t>2</w:t>
             </w:r>
           </w:p>
@@ -8753,7 +9059,50 @@
                 <w:sz w:val="22"/>
                 <w:szCs w:val="22"/>
               </w:rPr>
-              <w:t>3.47</w:t>
+              <w:t>3</w:t>
+            </w:r>
+          </w:p>
+        </w:tc>
+        <w:tc>
+          <w:tcPr>
+            <w:tcW w:w="0" w:type="auto"/>
+            <w:tcBorders>
+              <w:top w:val="single" w:sz="24" w:space="0" w:color="FFFFFF"/>
+              <w:left w:val="single" w:sz="8" w:space="0" w:color="FFFFFF"/>
+              <w:bottom w:val="single" w:sz="8" w:space="0" w:color="FFFFFF"/>
+              <w:right w:val="single" w:sz="8" w:space="0" w:color="FFFFFF"/>
+            </w:tcBorders>
+            <w:shd w:val="clear" w:color="auto" w:fill="CCD2D8"/>
+            <w:tcMar>
+              <w:top w:w="72" w:type="dxa"/>
+              <w:left w:w="144" w:type="dxa"/>
+              <w:bottom w:w="72" w:type="dxa"/>
+              <w:right w:w="144" w:type="dxa"/>
+            </w:tcMar>
+            <w:hideMark/>
+          </w:tcPr>
+          <w:p>
+            <w:pPr>
+              <w:spacing w:after="0"/>
+              <w:jc w:val="center"/>
+              <w:rPr>
+                <w:sz w:val="22"/>
+                <w:szCs w:val="22"/>
+              </w:rPr>
+            </w:pPr>
+            <w:r>
+              <w:rPr>
+                <w:sz w:val="22"/>
+                <w:szCs w:val="22"/>
+              </w:rPr>
+              <w:t>3.</w:t>
+            </w:r>
+            <w:r>
+              <w:rPr>
+                <w:sz w:val="22"/>
+                <w:szCs w:val="22"/>
+              </w:rPr>
+              <w:t>37</w:t>
             </w:r>
           </w:p>
         </w:tc>
@@ -8903,7 +9252,14 @@
                 <w:sz w:val="22"/>
                 <w:szCs w:val="22"/>
               </w:rPr>
-              <w:t>2.32</w:t>
+              <w:t>2.</w:t>
+            </w:r>
+            <w:r>
+              <w:rPr>
+                <w:sz w:val="22"/>
+                <w:szCs w:val="22"/>
+              </w:rPr>
+              <w:t>95</w:t>
             </w:r>
           </w:p>
         </w:tc>
@@ -8981,7 +9337,7 @@
                 <w:sz w:val="22"/>
                 <w:szCs w:val="22"/>
               </w:rPr>
-              <w:t>0</w:t>
+              <w:t>1</w:t>
             </w:r>
           </w:p>
         </w:tc>
@@ -9017,7 +9373,7 @@
                 <w:sz w:val="22"/>
                 <w:szCs w:val="22"/>
               </w:rPr>
-              <w:t>2</w:t>
+              <w:t>4</w:t>
             </w:r>
           </w:p>
         </w:tc>
@@ -9053,7 +9409,14 @@
                 <w:sz w:val="22"/>
                 <w:szCs w:val="22"/>
               </w:rPr>
-              <w:t>3.58</w:t>
+              <w:t>3.</w:t>
+            </w:r>
+            <w:r>
+              <w:rPr>
+                <w:sz w:val="22"/>
+                <w:szCs w:val="22"/>
+              </w:rPr>
+              <w:t>05</w:t>
             </w:r>
           </w:p>
         </w:tc>
@@ -9131,7 +9494,7 @@
                 <w:sz w:val="22"/>
                 <w:szCs w:val="22"/>
               </w:rPr>
-              <w:t>1</w:t>
+              <w:t>2</w:t>
             </w:r>
           </w:p>
         </w:tc>
@@ -9203,7 +9566,14 @@
                 <w:sz w:val="22"/>
                 <w:szCs w:val="22"/>
               </w:rPr>
-              <w:t>3.05</w:t>
+              <w:t>2.</w:t>
+            </w:r>
+            <w:r>
+              <w:rPr>
+                <w:sz w:val="22"/>
+                <w:szCs w:val="22"/>
+              </w:rPr>
+              <w:t>95</w:t>
             </w:r>
           </w:p>
         </w:tc>
@@ -9502,10 +9872,10 @@
           <w:noProof/>
         </w:rPr>
         <w:drawing>
-          <wp:inline distT="0" distB="0" distL="0" distR="0" wp14:anchorId="77F8D742" wp14:editId="29ED2405">
-            <wp:extent cx="6492240" cy="2433955"/>
-            <wp:effectExtent l="0" t="0" r="3810" b="4445"/>
-            <wp:docPr id="84075643" name="Picture 4"/>
+          <wp:inline distT="0" distB="0" distL="0" distR="0" wp14:anchorId="510C59C6" wp14:editId="0214022D">
+            <wp:extent cx="6492240" cy="2493010"/>
+            <wp:effectExtent l="0" t="0" r="3810" b="2540"/>
+            <wp:docPr id="68483288" name="Picture 2"/>
             <wp:cNvGraphicFramePr>
               <a:graphicFrameLocks xmlns:a="http://schemas.openxmlformats.org/drawingml/2006/main" noChangeAspect="1"/>
             </wp:cNvGraphicFramePr>
@@ -9513,7 +9883,7 @@
               <a:graphicData uri="http://schemas.openxmlformats.org/drawingml/2006/picture">
                 <pic:pic xmlns:pic="http://schemas.openxmlformats.org/drawingml/2006/picture">
                   <pic:nvPicPr>
-                    <pic:cNvPr id="84075643" name="Picture 84075643"/>
+                    <pic:cNvPr id="68483288" name="Picture 68483288"/>
                     <pic:cNvPicPr/>
                   </pic:nvPicPr>
                   <pic:blipFill>
@@ -9531,7 +9901,7 @@
                   <pic:spPr>
                     <a:xfrm>
                       <a:off x="0" y="0"/>
-                      <a:ext cx="6492240" cy="2433955"/>
+                      <a:ext cx="6492240" cy="2493010"/>
                     </a:xfrm>
                     <a:prstGeom prst="rect">
                       <a:avLst/>
@@ -9717,10 +10087,10 @@
         </w:rPr>
         <w:lastRenderedPageBreak/>
         <w:drawing>
-          <wp:inline distT="0" distB="0" distL="0" distR="0" wp14:anchorId="669C91D3" wp14:editId="20783A3A">
-            <wp:extent cx="6654141" cy="5219700"/>
-            <wp:effectExtent l="0" t="0" r="0" b="0"/>
-            <wp:docPr id="1263227305" name="Picture 6"/>
+          <wp:inline distT="0" distB="0" distL="0" distR="0" wp14:anchorId="48A2ECE0" wp14:editId="7A2FE8C3">
+            <wp:extent cx="6492240" cy="5156200"/>
+            <wp:effectExtent l="0" t="0" r="3810" b="6350"/>
+            <wp:docPr id="2103464003" name="Picture 3"/>
             <wp:cNvGraphicFramePr>
               <a:graphicFrameLocks xmlns:a="http://schemas.openxmlformats.org/drawingml/2006/main" noChangeAspect="1"/>
             </wp:cNvGraphicFramePr>
@@ -9728,7 +10098,7 @@
               <a:graphicData uri="http://schemas.openxmlformats.org/drawingml/2006/picture">
                 <pic:pic xmlns:pic="http://schemas.openxmlformats.org/drawingml/2006/picture">
                   <pic:nvPicPr>
-                    <pic:cNvPr id="1263227305" name="Picture 1263227305"/>
+                    <pic:cNvPr id="2103464003" name="Picture 2103464003"/>
                     <pic:cNvPicPr/>
                   </pic:nvPicPr>
                   <pic:blipFill>
@@ -9746,7 +10116,7 @@
                   <pic:spPr>
                     <a:xfrm>
                       <a:off x="0" y="0"/>
-                      <a:ext cx="6658394" cy="5223036"/>
+                      <a:ext cx="6492240" cy="5156200"/>
                     </a:xfrm>
                     <a:prstGeom prst="rect">
                       <a:avLst/>
@@ -10071,13 +10441,49 @@
         <w:rPr>
           <w:noProof/>
         </w:rPr>
-        <w:t xml:space="preserve"> list of 'top 6 genes' has 28 genes in it</w:t>
-      </w:r>
-      <w:r>
-        <w:rPr>
-          <w:noProof/>
-        </w:rPr>
-        <w:t>, ‘top 10 genes’ has 43 genes and ‘top 24 genes’ has 73 genes</w:t>
+        <w:t xml:space="preserve"> list of 'top 6 genes' has 2</w:t>
+      </w:r>
+      <w:r>
+        <w:rPr>
+          <w:noProof/>
+        </w:rPr>
+        <w:t>5</w:t>
+      </w:r>
+      <w:r>
+        <w:rPr>
+          <w:noProof/>
+        </w:rPr>
+        <w:t xml:space="preserve"> genes in it</w:t>
+      </w:r>
+      <w:r>
+        <w:rPr>
+          <w:noProof/>
+        </w:rPr>
+        <w:t xml:space="preserve">, ‘top 10 genes’ has </w:t>
+      </w:r>
+      <w:r>
+        <w:rPr>
+          <w:noProof/>
+        </w:rPr>
+        <w:t>35</w:t>
+      </w:r>
+      <w:r>
+        <w:rPr>
+          <w:noProof/>
+        </w:rPr>
+        <w:t xml:space="preserve"> genes and ‘top 24 genes’ has </w:t>
+      </w:r>
+      <w:r>
+        <w:rPr>
+          <w:noProof/>
+        </w:rPr>
+        <w:t>66</w:t>
+      </w:r>
+      <w:r>
+        <w:rPr>
+          <w:noProof/>
+        </w:rPr>
+        <w:t xml:space="preserve"> genes</w:t>
       </w:r>
       <w:r>
         <w:rPr>
@@ -10197,7 +10603,25 @@
         <w:rPr>
           <w:noProof/>
         </w:rPr>
-        <w:t xml:space="preserve">, for example, was </w:t>
+        <w:t xml:space="preserve"> and DNAJC30</w:t>
+      </w:r>
+      <w:r>
+        <w:rPr>
+          <w:noProof/>
+        </w:rPr>
+        <w:t>, for example, w</w:t>
+      </w:r>
+      <w:r>
+        <w:rPr>
+          <w:noProof/>
+        </w:rPr>
+        <w:t>ere</w:t>
+      </w:r>
+      <w:r>
+        <w:rPr>
+          <w:noProof/>
+        </w:rPr>
+        <w:t xml:space="preserve"> </w:t>
       </w:r>
       <w:r>
         <w:rPr>
@@ -10252,7 +10676,13 @@
         <w:rPr>
           <w:noProof/>
         </w:rPr>
-        <w:t>twenty-two</w:t>
+        <w:t>twenty-t</w:t>
+      </w:r>
+      <w:r>
+        <w:rPr>
+          <w:noProof/>
+        </w:rPr>
+        <w:t>wo</w:t>
       </w:r>
       <w:r>
         <w:rPr>
@@ -10264,7 +10694,19 @@
         <w:rPr>
           <w:noProof/>
         </w:rPr>
-        <w:t>in the ‘top 24 genes’ nine or more</w:t>
+        <w:t xml:space="preserve">in the ‘top 24 genes’ </w:t>
+      </w:r>
+      <w:r>
+        <w:rPr>
+          <w:noProof/>
+        </w:rPr>
+        <w:t>ten</w:t>
+      </w:r>
+      <w:r>
+        <w:rPr>
+          <w:noProof/>
+        </w:rPr>
+        <w:t xml:space="preserve"> or more</w:t>
       </w:r>
       <w:r>
         <w:rPr>
@@ -10282,19 +10724,13 @@
         <w:rPr>
           <w:noProof/>
         </w:rPr>
-        <w:t>Twenty</w:t>
-      </w:r>
-      <w:r>
-        <w:rPr>
-          <w:noProof/>
-        </w:rPr>
-        <w:t>-</w:t>
-      </w:r>
-      <w:r>
-        <w:rPr>
-          <w:noProof/>
-        </w:rPr>
-        <w:t xml:space="preserve">one of these genes are also in the ‘top 10 genes’ list and nineteen are in the ‘top 6 genes’ list.  These genes could be a core </w:t>
+        <w:t>All</w:t>
+      </w:r>
+      <w:r>
+        <w:rPr>
+          <w:noProof/>
+        </w:rPr>
+        <w:t xml:space="preserve"> of these genes are also in the ‘top 10 genes’ list and nineteen are in the ‘top 6 genes’ list.  These genes could be a core </w:t>
       </w:r>
       <w:r>
         <w:rPr>
@@ -10699,67 +11135,7 @@
         <w:rPr>
           <w:noProof/>
         </w:rPr>
-        <w:t xml:space="preserve">top twenty-two genes were selected for each split.  The </w:t>
-      </w:r>
-      <w:r>
-        <w:rPr>
-          <w:noProof/>
-        </w:rPr>
-        <w:t xml:space="preserve">‘predictor’ model was </w:t>
-      </w:r>
-      <w:r>
-        <w:rPr>
-          <w:noProof/>
-        </w:rPr>
-        <w:t xml:space="preserve">then trained </w:t>
-      </w:r>
-      <w:r>
-        <w:rPr>
-          <w:noProof/>
-        </w:rPr>
-        <w:t>on one to twenty-two features from th</w:t>
-      </w:r>
-      <w:r>
-        <w:rPr>
-          <w:noProof/>
-        </w:rPr>
-        <w:t>is split-specific</w:t>
-      </w:r>
-      <w:r>
-        <w:rPr>
-          <w:noProof/>
-        </w:rPr>
-        <w:t xml:space="preserve"> sorted list to generate the MAE features selection curves</w:t>
-      </w:r>
-      <w:r>
-        <w:rPr>
-          <w:noProof/>
-        </w:rPr>
-        <w:t xml:space="preserve"> </w:t>
-      </w:r>
-      <w:r>
-        <w:rPr>
-          <w:noProof/>
-        </w:rPr>
-        <w:t>(Figure 11</w:t>
-      </w:r>
-      <w:r>
-        <w:rPr>
-          <w:noProof/>
-        </w:rPr>
-        <w:t>b</w:t>
-      </w:r>
-      <w:r>
-        <w:rPr>
-          <w:noProof/>
-        </w:rPr>
-        <w:t>).</w:t>
-      </w:r>
-      <w:r>
-        <w:rPr>
-          <w:noProof/>
-        </w:rPr>
-        <w:t xml:space="preserve">  The mean MAE </w:t>
+        <w:t xml:space="preserve">top twenty-two genes were selected for each split.  The ‘predictor’ model was then trained on one to twenty-two features from this split-specific sorted list to generate the MAE features selection curves (Figure 11b).  The mean MAE </w:t>
       </w:r>
       <w:r>
         <w:rPr>
@@ -10958,19 +11334,7 @@
         <w:rPr>
           <w:noProof/>
         </w:rPr>
-        <w:t xml:space="preserve"> (</w:t>
-      </w:r>
-      <w:r>
-        <w:rPr>
-          <w:noProof/>
-        </w:rPr>
-        <w:t>Figure 11e</w:t>
-      </w:r>
-      <w:r>
-        <w:rPr>
-          <w:noProof/>
-        </w:rPr>
-        <w:t>)</w:t>
+        <w:t xml:space="preserve"> (Figure 11e)</w:t>
       </w:r>
       <w:r>
         <w:rPr>
@@ -11061,7 +11425,19 @@
         <w:rPr>
           <w:noProof/>
         </w:rPr>
-        <w:t>9986</w:t>
+        <w:t>0</w:t>
+      </w:r>
+      <w:r>
+        <w:rPr>
+          <w:noProof/>
+        </w:rPr>
+        <w:t>9</w:t>
+      </w:r>
+      <w:r>
+        <w:rPr>
+          <w:noProof/>
+        </w:rPr>
+        <w:t>14</w:t>
       </w:r>
       <w:r>
         <w:rPr>
@@ -11085,7 +11461,25 @@
         <w:rPr>
           <w:noProof/>
         </w:rPr>
-        <w:t xml:space="preserve">0.01017.  </w:t>
+        <w:t>0.0</w:t>
+      </w:r>
+      <w:r>
+        <w:rPr>
+          <w:noProof/>
+        </w:rPr>
+        <w:t>09</w:t>
+      </w:r>
+      <w:r>
+        <w:rPr>
+          <w:noProof/>
+        </w:rPr>
+        <w:t>57</w:t>
+      </w:r>
+      <w:r>
+        <w:rPr>
+          <w:noProof/>
+        </w:rPr>
+        <w:t xml:space="preserve">.  </w:t>
       </w:r>
     </w:p>
     <w:p>
@@ -11100,10 +11494,10 @@
         </w:rPr>
         <w:lastRenderedPageBreak/>
         <w:drawing>
-          <wp:inline distT="0" distB="0" distL="0" distR="0" wp14:anchorId="32D2DB05" wp14:editId="38F9C289">
-            <wp:extent cx="6492240" cy="7212330"/>
-            <wp:effectExtent l="0" t="0" r="3810" b="7620"/>
-            <wp:docPr id="1329548160" name="Picture 9"/>
+          <wp:inline distT="0" distB="0" distL="0" distR="0" wp14:anchorId="7EF60A40" wp14:editId="04814C50">
+            <wp:extent cx="6492240" cy="7421245"/>
+            <wp:effectExtent l="0" t="0" r="3810" b="8255"/>
+            <wp:docPr id="1348198647" name="Picture 2"/>
             <wp:cNvGraphicFramePr>
               <a:graphicFrameLocks xmlns:a="http://schemas.openxmlformats.org/drawingml/2006/main" noChangeAspect="1"/>
             </wp:cNvGraphicFramePr>
@@ -11111,7 +11505,7 @@
               <a:graphicData uri="http://schemas.openxmlformats.org/drawingml/2006/picture">
                 <pic:pic xmlns:pic="http://schemas.openxmlformats.org/drawingml/2006/picture">
                   <pic:nvPicPr>
-                    <pic:cNvPr id="1329548160" name="Picture 1329548160"/>
+                    <pic:cNvPr id="1348198647" name="Picture 1348198647"/>
                     <pic:cNvPicPr/>
                   </pic:nvPicPr>
                   <pic:blipFill>
@@ -11129,7 +11523,7 @@
                   <pic:spPr>
                     <a:xfrm>
                       <a:off x="0" y="0"/>
-                      <a:ext cx="6492240" cy="7212330"/>
+                      <a:ext cx="6492240" cy="7421245"/>
                     </a:xfrm>
                     <a:prstGeom prst="rect">
                       <a:avLst/>
@@ -11199,31 +11593,7 @@
           <w:sz w:val="22"/>
           <w:szCs w:val="22"/>
         </w:rPr>
-        <w:t xml:space="preserve">B) </w:t>
-      </w:r>
-      <w:r>
-        <w:rPr>
-          <w:noProof/>
-          <w:sz w:val="22"/>
-          <w:szCs w:val="22"/>
-        </w:rPr>
-        <w:t xml:space="preserve">Feature selection curves over 20 splits using </w:t>
-      </w:r>
-      <w:r>
-        <w:rPr>
-          <w:noProof/>
-          <w:sz w:val="22"/>
-          <w:szCs w:val="22"/>
-        </w:rPr>
-        <w:t>automatic</w:t>
-      </w:r>
-      <w:r>
-        <w:rPr>
-          <w:noProof/>
-          <w:sz w:val="22"/>
-          <w:szCs w:val="22"/>
-        </w:rPr>
-        <w:t xml:space="preserve"> gene selection </w:t>
+        <w:t xml:space="preserve">B) Feature selection curves over 20 splits using automatic gene selection </w:t>
       </w:r>
       <w:r>
         <w:rPr>
@@ -12020,7 +12390,31 @@
     </w:p>
     <w:p>
       <w:r>
-        <w:t>Chu LF, Leng N, Zhang J, Hou Z, Mamott D, Vereide DT, Choi J, Kendziorski C, Stewart R, Thomson JA. Single-cell RNA-seq reveals novel regulators of human embryonic stem cell differentiation to definitive endoderm. Genome Biol. 2016 Aug 17;17(1):173. doi: 10.1186/s13059-016-1033-x. PMID: 27534536; PMCID: PMC4989499.</w:t>
+        <w:t xml:space="preserve">Chu LF, Leng N, Zhang J, Hou Z, </w:t>
+      </w:r>
+      <w:proofErr w:type="spellStart"/>
+      <w:r>
+        <w:t>Mamott</w:t>
+      </w:r>
+      <w:proofErr w:type="spellEnd"/>
+      <w:r>
+        <w:t xml:space="preserve"> D, </w:t>
+      </w:r>
+      <w:proofErr w:type="spellStart"/>
+      <w:r>
+        <w:t>Vereide</w:t>
+      </w:r>
+      <w:proofErr w:type="spellEnd"/>
+      <w:r>
+        <w:t xml:space="preserve"> DT, Choi J, Kendziorski C, Stewart R, Thomson JA. Single-cell RNA-seq reveals novel regulators of human embryonic stem cell differentiation to definitive endoderm. Genome Biol. 2016 Aug 17;17(1):173. </w:t>
+      </w:r>
+      <w:proofErr w:type="spellStart"/>
+      <w:r>
+        <w:t>doi</w:t>
+      </w:r>
+      <w:proofErr w:type="spellEnd"/>
+      <w:r>
+        <w:t>: 10.1186/s13059-016-1033-x. PMID: 27534536; PMCID: PMC4989499.</w:t>
       </w:r>
     </w:p>
     <w:p>
@@ -12037,8 +12431,53 @@
       </w:hyperlink>
     </w:p>
     <w:p>
-      <w:r>
-        <w:t>Jerber J, Seaton DD, Cuomo ASE, Kumasaka N, Haldane J, Steer J, Patel M, Pearce D, Andersson M, Bonder MJ, Mountjoy E, Ghoussaini M, Lancaster MA; HipSci Consortium; Marioni JC, Merkle FT, Gaffney DJ, Stegle O. Population-scale single-cell RNA-seq profiling across dopaminergic neuron differentiation. Nat Genet. 2021 Mar;53(3):304-312. doi: 10.1038/s41588-021-00801-6. Epub 2021 Mar 4. PMID: 33664506; PMCID: PMC7610897.</w:t>
+      <w:proofErr w:type="spellStart"/>
+      <w:r>
+        <w:t>Jerber</w:t>
+      </w:r>
+      <w:proofErr w:type="spellEnd"/>
+      <w:r>
+        <w:t xml:space="preserve"> J, Seaton DD, Cuomo ASE, Kumasaka N, Haldane J, Steer J, Patel M, Pearce D, Andersson M, Bonder MJ, Mountjoy E, </w:t>
+      </w:r>
+      <w:proofErr w:type="spellStart"/>
+      <w:r>
+        <w:t>Ghoussaini</w:t>
+      </w:r>
+      <w:proofErr w:type="spellEnd"/>
+      <w:r>
+        <w:t xml:space="preserve"> M, Lancaster MA; </w:t>
+      </w:r>
+      <w:proofErr w:type="spellStart"/>
+      <w:r>
+        <w:t>HipSci</w:t>
+      </w:r>
+      <w:proofErr w:type="spellEnd"/>
+      <w:r>
+        <w:t xml:space="preserve"> Consortium; Marioni JC, Merkle FT, Gaffney DJ, </w:t>
+      </w:r>
+      <w:proofErr w:type="spellStart"/>
+      <w:r>
+        <w:t>Stegle</w:t>
+      </w:r>
+      <w:proofErr w:type="spellEnd"/>
+      <w:r>
+        <w:t xml:space="preserve"> O. Population-scale single-cell RNA-seq profiling across dopaminergic neuron differentiation. Nat Genet. 2021 Mar;53(3):304-312. </w:t>
+      </w:r>
+      <w:proofErr w:type="spellStart"/>
+      <w:r>
+        <w:t>doi</w:t>
+      </w:r>
+      <w:proofErr w:type="spellEnd"/>
+      <w:r>
+        <w:t xml:space="preserve">: 10.1038/s41588-021-00801-6. </w:t>
+      </w:r>
+      <w:proofErr w:type="spellStart"/>
+      <w:r>
+        <w:t>Epub</w:t>
+      </w:r>
+      <w:proofErr w:type="spellEnd"/>
+      <w:r>
+        <w:t xml:space="preserve"> 2021 Mar 4. PMID: 33664506; PMCID: PMC7610897.</w:t>
       </w:r>
     </w:p>
     <w:p>
@@ -12049,8 +12488,45 @@
           <w:shd w:val="clear" w:color="auto" w:fill="FFFFFF"/>
         </w:rPr>
       </w:pPr>
-      <w:r>
-        <w:t>Liberzon A, Birger C, Thorvaldsdóttir H, Ghandi M, Mesirov JP, Tamayo P. The Molecular Signatures Database (MSigDB) hallmark gene set collection. Cell Syst. 2015 Dec 23;1(6):417-425. doi: 10.1016/j.cels.2015.12.004. PMID: 26771021; PMCID: PMC4707969.</w:t>
+      <w:proofErr w:type="spellStart"/>
+      <w:r>
+        <w:t>Liberzon</w:t>
+      </w:r>
+      <w:proofErr w:type="spellEnd"/>
+      <w:r>
+        <w:t xml:space="preserve"> A, Birger C, </w:t>
+      </w:r>
+      <w:proofErr w:type="spellStart"/>
+      <w:r>
+        <w:t>Thorvaldsdóttir</w:t>
+      </w:r>
+      <w:proofErr w:type="spellEnd"/>
+      <w:r>
+        <w:t xml:space="preserve"> H, Ghandi M, </w:t>
+      </w:r>
+      <w:proofErr w:type="spellStart"/>
+      <w:r>
+        <w:t>Mesirov</w:t>
+      </w:r>
+      <w:proofErr w:type="spellEnd"/>
+      <w:r>
+        <w:t xml:space="preserve"> JP, Tamayo P. The Molecular Signatures Database (</w:t>
+      </w:r>
+      <w:proofErr w:type="spellStart"/>
+      <w:r>
+        <w:t>MSigDB</w:t>
+      </w:r>
+      <w:proofErr w:type="spellEnd"/>
+      <w:r>
+        <w:t xml:space="preserve">) hallmark gene set collection. Cell Syst. 2015 Dec 23;1(6):417-425. </w:t>
+      </w:r>
+      <w:proofErr w:type="spellStart"/>
+      <w:r>
+        <w:t>doi</w:t>
+      </w:r>
+      <w:proofErr w:type="spellEnd"/>
+      <w:r>
+        <w:t>: 10.1016/j.cels.2015.12.004. PMID: 26771021; PMCID: PMC4707969.</w:t>
       </w:r>
       <w:r>
         <w:rPr>
@@ -15109,6 +15585,7 @@
   <w:style w:type="character" w:default="1" w:styleId="DefaultParagraphFont">
     <w:name w:val="Default Paragraph Font"/>
     <w:uiPriority w:val="1"/>
+    <w:semiHidden/>
     <w:unhideWhenUsed/>
   </w:style>
   <w:style w:type="table" w:default="1" w:styleId="TableNormal">

</xml_diff>